<commit_message>
Store upgrade: new kit prices, ITR and Freelancer kits, GST Compliance and Accounting kit upgrades
</commit_message>
<xml_diff>
--- a/private-downloads/GST-Notice-Reply-Formats.docx
+++ b/private-downloads/GST-Notice-Reply-Formats.docx
@@ -23,7 +23,7 @@
         <w:rPr>
           <w:color w:val="D99A2B"/>
         </w:rPr>
-        <w:t>Ready-to-edit drafts for the most common GST notices</w:t>
+        <w:t>14 ready-to-edit drafts for the most common GST notices, orders and appeals</w:t>
         <w:br/>
         <w:t>Rajput Lalit &amp; Associates · www.rajputlalitassociates.in · WhatsApp +91 93549 53603</w:t>
       </w:r>
@@ -120,6 +120,54 @@
       </w:pPr>
       <w:r>
         <w:t>DRC-01A (intimation before show cause notice): reply in Part B by the date mentioned in the intimation.</w:t>
+      </w:r>
+    </w:p>
+    <w:p>
+      <w:pPr>
+        <w:pStyle w:val="ListBullet"/>
+      </w:pPr>
+      <w:r>
+        <w:t>DRC-01B (GSTR-1 vs GSTR-3B liability gap) and DRC-01C (ITC in 3B more than 2B): pay or explain in Part B within 7 days.</w:t>
+      </w:r>
+    </w:p>
+    <w:p>
+      <w:pPr>
+        <w:pStyle w:val="ListBullet"/>
+      </w:pPr>
+      <w:r>
+        <w:t>DRC-01 (show cause notice / demand): reply in Form DRC-06 within the time stated in the notice — usually 30 days.</w:t>
+      </w:r>
+    </w:p>
+    <w:p>
+      <w:pPr>
+        <w:pStyle w:val="ListBullet"/>
+      </w:pPr>
+      <w:r>
+        <w:t>REG-03 (query on a new registration application): reply in Form REG-04 within 7 working days.</w:t>
+      </w:r>
+    </w:p>
+    <w:p>
+      <w:pPr>
+        <w:pStyle w:val="ListBullet"/>
+      </w:pPr>
+      <w:r>
+        <w:t>GSTR-3A (notice to a non-filer): file the pending return within 15 days.</w:t>
+      </w:r>
+    </w:p>
+    <w:p>
+      <w:pPr>
+        <w:pStyle w:val="ListBullet"/>
+      </w:pPr>
+      <w:r>
+        <w:t>Cancellation already ordered (REG-19)? Apply for revocation in REG-21 within 90 days of the order (the law allows a further extension in some cases).</w:t>
+      </w:r>
+    </w:p>
+    <w:p>
+      <w:pPr>
+        <w:pStyle w:val="ListBullet"/>
+      </w:pPr>
+      <w:r>
+        <w:t>Order passed (DRC-07)? Rectification request within 3 months (Section 161); appeal in APL-01 within 3 months of the order (Section 107), with the pre-deposit.</w:t>
       </w:r>
     </w:p>
     <w:p>
@@ -2006,6 +2054,1506 @@
     </w:p>
     <w:p>
       <w:r>
+        <w:br w:type="page"/>
+      </w:r>
+    </w:p>
+    <w:p>
+      <w:pPr>
+        <w:pStyle w:val="Heading1"/>
+      </w:pPr>
+      <w:r>
+        <w:rPr>
+          <w:color w:val="002B5C"/>
+        </w:rPr>
+        <w:t>Format 8 — Reply to Show Cause Notice in Form GST DRC-01 (Demand)</w:t>
+      </w:r>
+    </w:p>
+    <w:p>
+      <w:r>
+        <w:rPr>
+          <w:b w:val="0"/>
+          <w:i/>
+        </w:rPr>
+        <w:t>Filed in Form GST DRC-06 under Section 73 / 74 (periods up to FY 2023-24) or Section 74A (FY 2024-25 onwards). This is the most important reply — whatever is not raised here is hard to raise later in appeal.</w:t>
+      </w:r>
+    </w:p>
+    <w:p>
+      <w:r>
+        <w:rPr>
+          <w:b/>
+          <w:i w:val="0"/>
+        </w:rPr>
+        <w:t>[YOUR BUSINESS NAME]</w:t>
+        <w:br/>
+        <w:t>[Address]</w:t>
+        <w:br/>
+        <w:t>GSTIN: [__________]     Phone: [__________]     Email: [__________]</w:t>
+      </w:r>
+    </w:p>
+    <w:p>
+      <w:r>
+        <w:rPr>
+          <w:b w:val="0"/>
+          <w:i w:val="0"/>
+        </w:rPr>
+        <w:t>Date: [DD-MM-YYYY]</w:t>
+      </w:r>
+    </w:p>
+    <w:p>
+      <w:r>
+        <w:rPr>
+          <w:b w:val="0"/>
+          <w:i w:val="0"/>
+        </w:rPr>
+        <w:t>To,</w:t>
+        <w:br/>
+        <w:t>The Proper Officer / [Designation],</w:t>
+        <w:br/>
+        <w:t>[Ward / Range / Circle],</w:t>
+        <w:br/>
+        <w:t>[State GST / CGST Office Address]</w:t>
+      </w:r>
+    </w:p>
+    <w:p>
+      <w:r>
+        <w:rPr>
+          <w:b/>
+          <w:i w:val="0"/>
+        </w:rPr>
+        <w:t>Subject: Reply to Show Cause Notice in Form GST DRC-01 for the period [__________]</w:t>
+      </w:r>
+    </w:p>
+    <w:p>
+      <w:r>
+        <w:rPr>
+          <w:b w:val="0"/>
+          <w:i w:val="0"/>
+        </w:rPr>
+        <w:t>Reference: SCN No. [__________] dated [DD-MM-YYYY]; DIN [__________]; GSTIN [__________]</w:t>
+      </w:r>
+    </w:p>
+    <w:p>
+      <w:r>
+        <w:rPr>
+          <w:b w:val="0"/>
+          <w:i w:val="0"/>
+        </w:rPr>
+        <w:t>Respected Sir / Madam,</w:t>
+      </w:r>
+    </w:p>
+    <w:p>
+      <w:pPr>
+        <w:pStyle w:val="Heading3"/>
+      </w:pPr>
+      <w:r>
+        <w:rPr>
+          <w:color w:val="002B5C"/>
+        </w:rPr>
+        <w:t>A. Preliminary submissions (use only those that apply)</w:t>
+      </w:r>
+    </w:p>
+    <w:p>
+      <w:pPr>
+        <w:pStyle w:val="ListBullet"/>
+      </w:pPr>
+      <w:r>
+        <w:t>Limitation: the notice for [period] has been issued on [date], beyond the time limit prescribed for that period, and is therefore barred by limitation.</w:t>
+      </w:r>
+    </w:p>
+    <w:p>
+      <w:pPr>
+        <w:pStyle w:val="ListBullet"/>
+      </w:pPr>
+      <w:r>
+        <w:t>The notice does not bear a valid Document Identification Number (DIN) / is not digitally signed [where applicable].</w:t>
+      </w:r>
+    </w:p>
+    <w:p>
+      <w:pPr>
+        <w:pStyle w:val="ListBullet"/>
+      </w:pPr>
+      <w:r>
+        <w:t>The notice does not give the basis of calculation, nor the documents relied upon. We request copies of all relied-upon documents and reserve the right to file an additional reply after receiving them.</w:t>
+      </w:r>
+    </w:p>
+    <w:p>
+      <w:pPr>
+        <w:pStyle w:val="ListBullet"/>
+      </w:pPr>
+      <w:r>
+        <w:t>Section 74 / extended period is invoked without any specific allegation or evidence of fraud, wilful misstatement or suppression of facts. All transactions are recorded in our books and returns.</w:t>
+      </w:r>
+    </w:p>
+    <w:p>
+      <w:pPr>
+        <w:pStyle w:val="ListBullet"/>
+      </w:pPr>
+      <w:r>
+        <w:t>No DRC-01A intimation / pre-notice consultation was given before the notice [if relevant for the period].</w:t>
+      </w:r>
+    </w:p>
+    <w:p>
+      <w:pPr>
+        <w:pStyle w:val="Heading3"/>
+      </w:pPr>
+      <w:r>
+        <w:rPr>
+          <w:color w:val="002B5C"/>
+        </w:rPr>
+        <w:t>B. Submissions on merits — point-wise</w:t>
+      </w:r>
+    </w:p>
+    <w:p>
+      <w:r>
+        <w:rPr>
+          <w:b w:val="0"/>
+          <w:i w:val="0"/>
+        </w:rPr>
+        <w:t>Para [ ] of the SCN — [summarise the allegation and amount]</w:t>
+      </w:r>
+    </w:p>
+    <w:p>
+      <w:r>
+        <w:rPr>
+          <w:b w:val="0"/>
+          <w:i w:val="0"/>
+        </w:rPr>
+        <w:t>Our reply: [facts → documents (Annexure) → legal provision / circular / judgment relied upon → conclusion that the amount is not payable]</w:t>
+      </w:r>
+    </w:p>
+    <w:p>
+      <w:r>
+        <w:rPr>
+          <w:b w:val="0"/>
+          <w:i/>
+        </w:rPr>
+        <w:t>(Repeat for every paragraph of the notice. Do not leave any allegation unanswered.)</w:t>
+      </w:r>
+    </w:p>
+    <w:p>
+      <w:pPr>
+        <w:pStyle w:val="Heading3"/>
+      </w:pPr>
+      <w:r>
+        <w:rPr>
+          <w:color w:val="002B5C"/>
+        </w:rPr>
+        <w:t>C. Interest and penalty</w:t>
+      </w:r>
+    </w:p>
+    <w:p>
+      <w:r>
+        <w:rPr>
+          <w:b w:val="0"/>
+          <w:i w:val="0"/>
+        </w:rPr>
+        <w:t>As no tax is payable for the reasons above, interest under Section 50 and penalty do not arise. Without prejudice, [if part is admitted]: tax of ₹[ ] with interest of ₹[ ] has been paid vide DRC-03 ARN [ ] dated [ ], within the period allowed for paying without penalty — the proceedings for that part may be concluded.</w:t>
+      </w:r>
+    </w:p>
+    <w:p>
+      <w:r>
+        <w:rPr>
+          <w:b w:val="0"/>
+          <w:i/>
+        </w:rPr>
+        <w:t>Tip: in non-fraud cases, paying the admitted tax with interest within 30 days of the SCN (Section 73) or within 60 days (Section 74A) generally means no penalty for that part.</w:t>
+      </w:r>
+    </w:p>
+    <w:p>
+      <w:pPr>
+        <w:pStyle w:val="Heading3"/>
+      </w:pPr>
+      <w:r>
+        <w:rPr>
+          <w:color w:val="002B5C"/>
+        </w:rPr>
+        <w:t>Prayer</w:t>
+      </w:r>
+    </w:p>
+    <w:p>
+      <w:r>
+        <w:rPr>
+          <w:b w:val="0"/>
+          <w:i w:val="0"/>
+        </w:rPr>
+        <w:t>We pray that the show cause notice be dropped in full, and that no demand of tax, interest or penalty be confirmed. We request a personal hearing under Section 75(4) before any order is passed.</w:t>
+      </w:r>
+    </w:p>
+    <w:p>
+      <w:r>
+        <w:rPr>
+          <w:b w:val="0"/>
+          <w:i w:val="0"/>
+        </w:rPr>
+        <w:t>We also request an opportunity of personal hearing before any adverse view is taken, as required by the principles of natural justice.</w:t>
+      </w:r>
+    </w:p>
+    <w:p>
+      <w:r>
+        <w:rPr>
+          <w:b w:val="0"/>
+          <w:i w:val="0"/>
+        </w:rPr>
+        <w:t>Verification: I/We hereby solemnly affirm that the information given above is true and correct to the best of my/our knowledge and belief, and nothing has been concealed therefrom.</w:t>
+      </w:r>
+    </w:p>
+    <w:p>
+      <w:r>
+        <w:rPr>
+          <w:b w:val="0"/>
+          <w:i w:val="0"/>
+        </w:rPr>
+        <w:t>Thanking you,</w:t>
+        <w:br/>
+        <w:t>Yours faithfully,</w:t>
+        <w:br/>
+        <w:br/>
+        <w:t>For [YOUR BUSINESS NAME]</w:t>
+        <w:br/>
+        <w:br/>
+        <w:br/>
+        <w:t>(Authorised Signatory)</w:t>
+        <w:br/>
+        <w:t>Name: [__________]</w:t>
+        <w:br/>
+        <w:t>Designation: [Proprietor / Partner / Director]</w:t>
+      </w:r>
+    </w:p>
+    <w:p>
+      <w:r>
+        <w:rPr>
+          <w:b w:val="0"/>
+          <w:i/>
+        </w:rPr>
+        <w:t>Enclosures: [list each document annexed — e.g. Annexure A: reconciliation statement; Annexure B: copies of invoices; Annexure C: GSTR-2B extract]</w:t>
+      </w:r>
+    </w:p>
+    <w:p>
+      <w:r>
+        <w:br w:type="page"/>
+      </w:r>
+    </w:p>
+    <w:p>
+      <w:pPr>
+        <w:pStyle w:val="Heading1"/>
+      </w:pPr>
+      <w:r>
+        <w:rPr>
+          <w:color w:val="002B5C"/>
+        </w:rPr>
+        <w:t>Format 9 — Reply to Notice in Form GSTR-3A (Return Not Filed)</w:t>
+      </w:r>
+    </w:p>
+    <w:p>
+      <w:r>
+        <w:rPr>
+          <w:b w:val="0"/>
+          <w:i/>
+        </w:rPr>
+        <w:t>Issued under Section 46. File the pending return(s) first — the letter only puts it on record.</w:t>
+      </w:r>
+    </w:p>
+    <w:p>
+      <w:r>
+        <w:rPr>
+          <w:b/>
+          <w:i w:val="0"/>
+        </w:rPr>
+        <w:t>[YOUR BUSINESS NAME]</w:t>
+        <w:br/>
+        <w:t>[Address]</w:t>
+        <w:br/>
+        <w:t>GSTIN: [__________]     Phone: [__________]     Email: [__________]</w:t>
+      </w:r>
+    </w:p>
+    <w:p>
+      <w:r>
+        <w:rPr>
+          <w:b w:val="0"/>
+          <w:i w:val="0"/>
+        </w:rPr>
+        <w:t>Date: [DD-MM-YYYY]</w:t>
+      </w:r>
+    </w:p>
+    <w:p>
+      <w:r>
+        <w:rPr>
+          <w:b w:val="0"/>
+          <w:i w:val="0"/>
+        </w:rPr>
+        <w:t>To,</w:t>
+        <w:br/>
+        <w:t>The Proper Officer / [Designation],</w:t>
+        <w:br/>
+        <w:t>[Ward / Range / Circle],</w:t>
+        <w:br/>
+        <w:t>[State GST / CGST Office Address]</w:t>
+      </w:r>
+    </w:p>
+    <w:p>
+      <w:r>
+        <w:rPr>
+          <w:b/>
+          <w:i w:val="0"/>
+        </w:rPr>
+        <w:t>Subject: Reply to notice in Form GSTR-3A for the tax period [MM/YYYY]</w:t>
+      </w:r>
+    </w:p>
+    <w:p>
+      <w:r>
+        <w:rPr>
+          <w:b w:val="0"/>
+          <w:i w:val="0"/>
+        </w:rPr>
+        <w:t>Reference: Notice No. [__________] dated [DD-MM-YYYY]; GSTIN [__________]</w:t>
+      </w:r>
+    </w:p>
+    <w:p>
+      <w:r>
+        <w:rPr>
+          <w:b w:val="0"/>
+          <w:i w:val="0"/>
+        </w:rPr>
+        <w:t>Respected Sir / Madam,</w:t>
+      </w:r>
+    </w:p>
+    <w:p>
+      <w:r>
+        <w:rPr>
+          <w:b w:val="0"/>
+          <w:i w:val="0"/>
+        </w:rPr>
+        <w:t>1. The return in Form [GSTR-3B / GSTR-1] for [period] could not be filed by the due date because [brief, genuine reason — e.g. delay in finalising accounts / illness of the proprietor / technical issue].</w:t>
+      </w:r>
+    </w:p>
+    <w:p>
+      <w:r>
+        <w:rPr>
+          <w:b w:val="0"/>
+          <w:i w:val="0"/>
+        </w:rPr>
+        <w:t>2. The return has now been filed on [date] vide ARN [__________], with tax of ₹[ ], interest of ₹[ ] and late fee of ₹[ ].</w:t>
+      </w:r>
+    </w:p>
+    <w:p>
+      <w:r>
+        <w:rPr>
+          <w:b w:val="0"/>
+          <w:i w:val="0"/>
+        </w:rPr>
+        <w:t>3. Since the return has been filed with all dues within the time allowed, we request that the proceedings be dropped. If an assessment order in Form ASMT-13 has been passed, it stands withdrawn under Section 62(2) as the return has been furnished within the period allowed by that section.</w:t>
+      </w:r>
+    </w:p>
+    <w:p>
+      <w:r>
+        <w:rPr>
+          <w:b w:val="0"/>
+          <w:i w:val="0"/>
+        </w:rPr>
+        <w:t>Thanking you,</w:t>
+        <w:br/>
+        <w:t>Yours faithfully,</w:t>
+        <w:br/>
+        <w:br/>
+        <w:t>For [YOUR BUSINESS NAME]</w:t>
+        <w:br/>
+        <w:br/>
+        <w:t>(Authorised Signatory)</w:t>
+      </w:r>
+    </w:p>
+    <w:p>
+      <w:r>
+        <w:br w:type="page"/>
+      </w:r>
+    </w:p>
+    <w:p>
+      <w:pPr>
+        <w:pStyle w:val="Heading1"/>
+      </w:pPr>
+      <w:r>
+        <w:rPr>
+          <w:color w:val="002B5C"/>
+        </w:rPr>
+        <w:t>Format 10 — Reply to Query on New Registration (Form GST REG-03 → reply in REG-04)</w:t>
+      </w:r>
+    </w:p>
+    <w:p>
+      <w:r>
+        <w:rPr>
+          <w:b w:val="0"/>
+          <w:i/>
+        </w:rPr>
+        <w:t>Reply within 7 working days or the application is likely to be rejected. Answer exactly what is asked and upload a clear document for each point.</w:t>
+      </w:r>
+    </w:p>
+    <w:p>
+      <w:r>
+        <w:rPr>
+          <w:b/>
+          <w:i w:val="0"/>
+        </w:rPr>
+        <w:t>[YOUR BUSINESS NAME]</w:t>
+        <w:br/>
+        <w:t>[Address]</w:t>
+        <w:br/>
+        <w:t>GSTIN: [__________]     Phone: [__________]     Email: [__________]</w:t>
+      </w:r>
+    </w:p>
+    <w:p>
+      <w:r>
+        <w:rPr>
+          <w:b w:val="0"/>
+          <w:i w:val="0"/>
+        </w:rPr>
+        <w:t>Date: [DD-MM-YYYY]</w:t>
+      </w:r>
+    </w:p>
+    <w:p>
+      <w:r>
+        <w:rPr>
+          <w:b w:val="0"/>
+          <w:i w:val="0"/>
+        </w:rPr>
+        <w:t>To,</w:t>
+        <w:br/>
+        <w:t>The Proper Officer / [Designation],</w:t>
+        <w:br/>
+        <w:t>[Ward / Range / Circle],</w:t>
+        <w:br/>
+        <w:t>[State GST / CGST Office Address]</w:t>
+      </w:r>
+    </w:p>
+    <w:p>
+      <w:r>
+        <w:rPr>
+          <w:b/>
+          <w:i w:val="0"/>
+        </w:rPr>
+        <w:t>Subject: Clarification in Form GST REG-04 against notice in Form GST REG-03</w:t>
+      </w:r>
+    </w:p>
+    <w:p>
+      <w:r>
+        <w:rPr>
+          <w:b w:val="0"/>
+          <w:i w:val="0"/>
+        </w:rPr>
+        <w:t>Reference: Application Reference No. (ARN) [__________] dated [DD-MM-YYYY]</w:t>
+      </w:r>
+    </w:p>
+    <w:p>
+      <w:r>
+        <w:rPr>
+          <w:b w:val="0"/>
+          <w:i w:val="0"/>
+        </w:rPr>
+        <w:t>Respected Sir / Madam,</w:t>
+      </w:r>
+    </w:p>
+    <w:tbl>
+      <w:tblPr>
+        <w:tblStyle w:val="LightGrid-Accent1"/>
+        <w:tblW w:type="auto" w:w="0"/>
+        <w:tblLook w:firstColumn="1" w:firstRow="1" w:lastColumn="0" w:lastRow="0" w:noHBand="0" w:noVBand="1" w:val="04A0"/>
+      </w:tblPr>
+      <w:tblGrid>
+        <w:gridCol w:w="2880"/>
+        <w:gridCol w:w="2880"/>
+        <w:gridCol w:w="2880"/>
+      </w:tblGrid>
+      <w:tr>
+        <w:tc>
+          <w:tcPr>
+            <w:tcW w:type="dxa" w:w="2880"/>
+          </w:tcPr>
+          <w:p>
+            <w:r>
+              <w:t>Query raised</w:t>
+            </w:r>
+          </w:p>
+        </w:tc>
+        <w:tc>
+          <w:tcPr>
+            <w:tcW w:type="dxa" w:w="2880"/>
+          </w:tcPr>
+          <w:p>
+            <w:r>
+              <w:t>Our clarification</w:t>
+            </w:r>
+          </w:p>
+        </w:tc>
+        <w:tc>
+          <w:tcPr>
+            <w:tcW w:type="dxa" w:w="2880"/>
+          </w:tcPr>
+          <w:p>
+            <w:r>
+              <w:t>Document uploaded</w:t>
+            </w:r>
+          </w:p>
+        </w:tc>
+      </w:tr>
+      <w:tr>
+        <w:tc>
+          <w:tcPr>
+            <w:tcW w:type="dxa" w:w="2880"/>
+          </w:tcPr>
+          <w:p>
+            <w:r>
+              <w:t>Proof of principal place of business not clear</w:t>
+            </w:r>
+          </w:p>
+        </w:tc>
+        <w:tc>
+          <w:tcPr>
+            <w:tcW w:type="dxa" w:w="2880"/>
+          </w:tcPr>
+          <w:p>
+            <w:r>
+              <w:t>The premises at [address] are [owned / rented]. [Rent agreement dated __ / ownership proof] uploaded.</w:t>
+            </w:r>
+          </w:p>
+        </w:tc>
+        <w:tc>
+          <w:tcPr>
+            <w:tcW w:type="dxa" w:w="2880"/>
+          </w:tcPr>
+          <w:p>
+            <w:r>
+              <w:t>Rent agreement + latest electricity bill of the owner</w:t>
+            </w:r>
+          </w:p>
+        </w:tc>
+      </w:tr>
+      <w:tr>
+        <w:tc>
+          <w:tcPr>
+            <w:tcW w:type="dxa" w:w="2880"/>
+          </w:tcPr>
+          <w:p>
+            <w:r>
+              <w:t>Consent / NOC of the owner</w:t>
+            </w:r>
+          </w:p>
+        </w:tc>
+        <w:tc>
+          <w:tcPr>
+            <w:tcW w:type="dxa" w:w="2880"/>
+          </w:tcPr>
+          <w:p>
+            <w:r>
+              <w:t>The owner [name] has given consent for use of the premises as our place of business.</w:t>
+            </w:r>
+          </w:p>
+        </w:tc>
+        <w:tc>
+          <w:tcPr>
+            <w:tcW w:type="dxa" w:w="2880"/>
+          </w:tcPr>
+          <w:p>
+            <w:r>
+              <w:t>Signed NOC + owner's ID proof</w:t>
+            </w:r>
+          </w:p>
+        </w:tc>
+      </w:tr>
+      <w:tr>
+        <w:tc>
+          <w:tcPr>
+            <w:tcW w:type="dxa" w:w="2880"/>
+          </w:tcPr>
+          <w:p>
+            <w:r>
+              <w:t>Photographs of the business premises</w:t>
+            </w:r>
+          </w:p>
+        </w:tc>
+        <w:tc>
+          <w:tcPr>
+            <w:tcW w:type="dxa" w:w="2880"/>
+          </w:tcPr>
+          <w:p>
+            <w:r>
+              <w:t>Photographs showing the name board and inside of the premises are uploaded.</w:t>
+            </w:r>
+          </w:p>
+        </w:tc>
+        <w:tc>
+          <w:tcPr>
+            <w:tcW w:type="dxa" w:w="2880"/>
+          </w:tcPr>
+          <w:p>
+            <w:r>
+              <w:t>Geo-tagged photographs</w:t>
+            </w:r>
+          </w:p>
+        </w:tc>
+      </w:tr>
+      <w:tr>
+        <w:tc>
+          <w:tcPr>
+            <w:tcW w:type="dxa" w:w="2880"/>
+          </w:tcPr>
+          <w:p>
+            <w:r>
+              <w:t>[Any other query]</w:t>
+            </w:r>
+          </w:p>
+        </w:tc>
+        <w:tc>
+          <w:tcPr>
+            <w:tcW w:type="dxa" w:w="2880"/>
+          </w:tcPr>
+          <w:p>
+            <w:r>
+              <w:t>[Reply]</w:t>
+            </w:r>
+          </w:p>
+        </w:tc>
+        <w:tc>
+          <w:tcPr>
+            <w:tcW w:type="dxa" w:w="2880"/>
+          </w:tcPr>
+          <w:p>
+            <w:r>
+              <w:t>[Document]</w:t>
+            </w:r>
+          </w:p>
+        </w:tc>
+      </w:tr>
+    </w:tbl>
+    <w:p>
+      <w:r>
+        <w:rPr>
+          <w:b w:val="0"/>
+          <w:i w:val="0"/>
+        </w:rPr>
+      </w:r>
+    </w:p>
+    <w:p>
+      <w:r>
+        <w:rPr>
+          <w:b w:val="0"/>
+          <w:i w:val="0"/>
+        </w:rPr>
+        <w:t>We request that the application be approved. We shall provide any further information required.</w:t>
+      </w:r>
+    </w:p>
+    <w:p>
+      <w:r>
+        <w:rPr>
+          <w:b w:val="0"/>
+          <w:i w:val="0"/>
+        </w:rPr>
+        <w:t>Thanking you,</w:t>
+        <w:br/>
+        <w:t>Yours faithfully,</w:t>
+        <w:br/>
+        <w:br/>
+        <w:t>[Name of applicant]</w:t>
+        <w:br/>
+        <w:t>(Proprietor / Authorised Signatory)</w:t>
+      </w:r>
+    </w:p>
+    <w:p>
+      <w:r>
+        <w:br w:type="page"/>
+      </w:r>
+    </w:p>
+    <w:p>
+      <w:pPr>
+        <w:pStyle w:val="Heading1"/>
+      </w:pPr>
+      <w:r>
+        <w:rPr>
+          <w:color w:val="002B5C"/>
+        </w:rPr>
+        <w:t>Format 11 — Application for Revocation of Cancelled Registration (Form GST REG-21)</w:t>
+      </w:r>
+    </w:p>
+    <w:p>
+      <w:r>
+        <w:rPr>
+          <w:b w:val="0"/>
+          <w:i/>
+        </w:rPr>
+        <w:t>Under Section 30 read with Rule 23. File all pending returns and pay dues first — the portal and the officer will check this. Time limit: 90 days from the date of the cancellation order.</w:t>
+      </w:r>
+    </w:p>
+    <w:p>
+      <w:r>
+        <w:rPr>
+          <w:b/>
+          <w:i w:val="0"/>
+        </w:rPr>
+        <w:t>[YOUR BUSINESS NAME]</w:t>
+        <w:br/>
+        <w:t>[Address]</w:t>
+        <w:br/>
+        <w:t>GSTIN: [__________]     Phone: [__________]     Email: [__________]</w:t>
+      </w:r>
+    </w:p>
+    <w:p>
+      <w:r>
+        <w:rPr>
+          <w:b w:val="0"/>
+          <w:i w:val="0"/>
+        </w:rPr>
+        <w:t>Date: [DD-MM-YYYY]</w:t>
+      </w:r>
+    </w:p>
+    <w:p>
+      <w:r>
+        <w:rPr>
+          <w:b w:val="0"/>
+          <w:i w:val="0"/>
+        </w:rPr>
+        <w:t>To,</w:t>
+        <w:br/>
+        <w:t>The Proper Officer / [Designation],</w:t>
+        <w:br/>
+        <w:t>[Ward / Range / Circle],</w:t>
+        <w:br/>
+        <w:t>[State GST / CGST Office Address]</w:t>
+      </w:r>
+    </w:p>
+    <w:p>
+      <w:r>
+        <w:rPr>
+          <w:b/>
+          <w:i w:val="0"/>
+        </w:rPr>
+        <w:t>Subject: Application for revocation of cancellation of registration</w:t>
+      </w:r>
+    </w:p>
+    <w:p>
+      <w:r>
+        <w:rPr>
+          <w:b w:val="0"/>
+          <w:i w:val="0"/>
+        </w:rPr>
+        <w:t>Reference: Cancellation Order No. [__________] dated [DD-MM-YYYY] (Form REG-19); GSTIN [__________]</w:t>
+      </w:r>
+    </w:p>
+    <w:p>
+      <w:r>
+        <w:rPr>
+          <w:b w:val="0"/>
+          <w:i w:val="0"/>
+        </w:rPr>
+        <w:t>Respected Sir / Madam,</w:t>
+      </w:r>
+    </w:p>
+    <w:p>
+      <w:r>
+        <w:rPr>
+          <w:b w:val="0"/>
+          <w:i w:val="0"/>
+        </w:rPr>
+        <w:t>1. Our registration was cancelled on the ground that [returns were not filed for (period) / business not found at the declared place / other].</w:t>
+      </w:r>
+    </w:p>
+    <w:p>
+      <w:r>
+        <w:rPr>
+          <w:b w:val="0"/>
+          <w:i w:val="0"/>
+        </w:rPr>
+        <w:t>2. The reason for the default was [genuine reason]. The business is running and we wish to continue complying with GST.</w:t>
+      </w:r>
+    </w:p>
+    <w:p>
+      <w:r>
+        <w:rPr>
+          <w:b w:val="0"/>
+          <w:i w:val="0"/>
+        </w:rPr>
+        <w:t>3. All returns up to the date of cancellation have now been filed, with tax, interest and late fee paid, as below:</w:t>
+      </w:r>
+    </w:p>
+    <w:tbl>
+      <w:tblPr>
+        <w:tblStyle w:val="LightGrid-Accent1"/>
+        <w:tblW w:type="auto" w:w="0"/>
+        <w:tblLook w:firstColumn="1" w:firstRow="1" w:lastColumn="0" w:lastRow="0" w:noHBand="0" w:noVBand="1" w:val="04A0"/>
+      </w:tblPr>
+      <w:tblGrid>
+        <w:gridCol w:w="2160"/>
+        <w:gridCol w:w="2160"/>
+        <w:gridCol w:w="2160"/>
+        <w:gridCol w:w="2160"/>
+      </w:tblGrid>
+      <w:tr>
+        <w:tc>
+          <w:tcPr>
+            <w:tcW w:type="dxa" w:w="2160"/>
+          </w:tcPr>
+          <w:p>
+            <w:r>
+              <w:t>Return</w:t>
+            </w:r>
+          </w:p>
+        </w:tc>
+        <w:tc>
+          <w:tcPr>
+            <w:tcW w:type="dxa" w:w="2160"/>
+          </w:tcPr>
+          <w:p>
+            <w:r>
+              <w:t>Period</w:t>
+            </w:r>
+          </w:p>
+        </w:tc>
+        <w:tc>
+          <w:tcPr>
+            <w:tcW w:type="dxa" w:w="2160"/>
+          </w:tcPr>
+          <w:p>
+            <w:r>
+              <w:t>Date filed</w:t>
+            </w:r>
+          </w:p>
+        </w:tc>
+        <w:tc>
+          <w:tcPr>
+            <w:tcW w:type="dxa" w:w="2160"/>
+          </w:tcPr>
+          <w:p>
+            <w:r>
+              <w:t>ARN</w:t>
+            </w:r>
+          </w:p>
+        </w:tc>
+      </w:tr>
+      <w:tr>
+        <w:tc>
+          <w:tcPr>
+            <w:tcW w:type="dxa" w:w="2160"/>
+          </w:tcPr>
+          <w:p>
+            <w:r>
+              <w:t>[ ]</w:t>
+            </w:r>
+          </w:p>
+        </w:tc>
+        <w:tc>
+          <w:tcPr>
+            <w:tcW w:type="dxa" w:w="2160"/>
+          </w:tcPr>
+          <w:p>
+            <w:r>
+              <w:t>[ ]</w:t>
+            </w:r>
+          </w:p>
+        </w:tc>
+        <w:tc>
+          <w:tcPr>
+            <w:tcW w:type="dxa" w:w="2160"/>
+          </w:tcPr>
+          <w:p>
+            <w:r>
+              <w:t>[ ]</w:t>
+            </w:r>
+          </w:p>
+        </w:tc>
+        <w:tc>
+          <w:tcPr>
+            <w:tcW w:type="dxa" w:w="2160"/>
+          </w:tcPr>
+          <w:p>
+            <w:r>
+              <w:t>[ ]</w:t>
+            </w:r>
+          </w:p>
+        </w:tc>
+      </w:tr>
+      <w:tr>
+        <w:tc>
+          <w:tcPr>
+            <w:tcW w:type="dxa" w:w="2160"/>
+          </w:tcPr>
+          <w:p>
+            <w:r>
+              <w:t>[ ]</w:t>
+            </w:r>
+          </w:p>
+        </w:tc>
+        <w:tc>
+          <w:tcPr>
+            <w:tcW w:type="dxa" w:w="2160"/>
+          </w:tcPr>
+          <w:p>
+            <w:r>
+              <w:t>[ ]</w:t>
+            </w:r>
+          </w:p>
+        </w:tc>
+        <w:tc>
+          <w:tcPr>
+            <w:tcW w:type="dxa" w:w="2160"/>
+          </w:tcPr>
+          <w:p>
+            <w:r>
+              <w:t>[ ]</w:t>
+            </w:r>
+          </w:p>
+        </w:tc>
+        <w:tc>
+          <w:tcPr>
+            <w:tcW w:type="dxa" w:w="2160"/>
+          </w:tcPr>
+          <w:p>
+            <w:r>
+              <w:t>[ ]</w:t>
+            </w:r>
+          </w:p>
+        </w:tc>
+      </w:tr>
+      <w:tr>
+        <w:tc>
+          <w:tcPr>
+            <w:tcW w:type="dxa" w:w="2160"/>
+          </w:tcPr>
+          <w:p>
+            <w:r>
+              <w:t>[ ]</w:t>
+            </w:r>
+          </w:p>
+        </w:tc>
+        <w:tc>
+          <w:tcPr>
+            <w:tcW w:type="dxa" w:w="2160"/>
+          </w:tcPr>
+          <w:p>
+            <w:r>
+              <w:t>[ ]</w:t>
+            </w:r>
+          </w:p>
+        </w:tc>
+        <w:tc>
+          <w:tcPr>
+            <w:tcW w:type="dxa" w:w="2160"/>
+          </w:tcPr>
+          <w:p>
+            <w:r>
+              <w:t>[ ]</w:t>
+            </w:r>
+          </w:p>
+        </w:tc>
+        <w:tc>
+          <w:tcPr>
+            <w:tcW w:type="dxa" w:w="2160"/>
+          </w:tcPr>
+          <w:p>
+            <w:r>
+              <w:t>[ ]</w:t>
+            </w:r>
+          </w:p>
+        </w:tc>
+      </w:tr>
+    </w:tbl>
+    <w:p>
+      <w:r>
+        <w:rPr>
+          <w:b w:val="0"/>
+          <w:i w:val="0"/>
+        </w:rPr>
+      </w:r>
+    </w:p>
+    <w:p>
+      <w:r>
+        <w:rPr>
+          <w:b w:val="0"/>
+          <w:i w:val="0"/>
+        </w:rPr>
+        <w:t>4. [If the ground was 'not found at the address':] The business continues at [address]; photographs, rent agreement and electricity bill are attached.</w:t>
+      </w:r>
+    </w:p>
+    <w:p>
+      <w:r>
+        <w:rPr>
+          <w:b w:val="0"/>
+          <w:i w:val="0"/>
+        </w:rPr>
+        <w:t>We request that the cancellation be revoked under Section 30 and the registration restored.</w:t>
+      </w:r>
+    </w:p>
+    <w:p>
+      <w:r>
+        <w:rPr>
+          <w:b w:val="0"/>
+          <w:i w:val="0"/>
+        </w:rPr>
+        <w:t>Thanking you,</w:t>
+        <w:br/>
+        <w:t>Yours faithfully,</w:t>
+        <w:br/>
+        <w:br/>
+        <w:t>For [YOUR BUSINESS NAME]</w:t>
+        <w:br/>
+        <w:br/>
+        <w:t>(Authorised Signatory)</w:t>
+      </w:r>
+    </w:p>
+    <w:p>
+      <w:r>
+        <w:br w:type="page"/>
+      </w:r>
+    </w:p>
+    <w:p>
+      <w:pPr>
+        <w:pStyle w:val="Heading1"/>
+      </w:pPr>
+      <w:r>
+        <w:rPr>
+          <w:color w:val="002B5C"/>
+        </w:rPr>
+        <w:t>Format 12 — Written Submissions after Personal Hearing</w:t>
+      </w:r>
+    </w:p>
+    <w:p>
+      <w:r>
+        <w:rPr>
+          <w:b/>
+          <w:i w:val="0"/>
+        </w:rPr>
+        <w:t>[YOUR BUSINESS NAME]</w:t>
+        <w:br/>
+        <w:t>[Address]</w:t>
+        <w:br/>
+        <w:t>GSTIN: [__________]     Phone: [__________]     Email: [__________]</w:t>
+      </w:r>
+    </w:p>
+    <w:p>
+      <w:r>
+        <w:rPr>
+          <w:b w:val="0"/>
+          <w:i w:val="0"/>
+        </w:rPr>
+        <w:t>Date: [DD-MM-YYYY]</w:t>
+      </w:r>
+    </w:p>
+    <w:p>
+      <w:r>
+        <w:rPr>
+          <w:b w:val="0"/>
+          <w:i w:val="0"/>
+        </w:rPr>
+        <w:t>To,</w:t>
+        <w:br/>
+        <w:t>The Proper Officer / [Designation],</w:t>
+        <w:br/>
+        <w:t>[Ward / Range / Circle],</w:t>
+        <w:br/>
+        <w:t>[State GST / CGST Office Address]</w:t>
+      </w:r>
+    </w:p>
+    <w:p>
+      <w:r>
+        <w:rPr>
+          <w:b/>
+          <w:i w:val="0"/>
+        </w:rPr>
+        <w:t>Subject: Written submissions following the personal hearing held on [DD-MM-YYYY]</w:t>
+      </w:r>
+    </w:p>
+    <w:p>
+      <w:r>
+        <w:rPr>
+          <w:b w:val="0"/>
+          <w:i w:val="0"/>
+        </w:rPr>
+        <w:t>Reference: SCN / Notice No. [__________] dated [DD-MM-YYYY]; GSTIN [__________]</w:t>
+      </w:r>
+    </w:p>
+    <w:p>
+      <w:r>
+        <w:rPr>
+          <w:b w:val="0"/>
+          <w:i w:val="0"/>
+        </w:rPr>
+        <w:t>Respected Sir / Madam,</w:t>
+      </w:r>
+    </w:p>
+    <w:p>
+      <w:r>
+        <w:rPr>
+          <w:b w:val="0"/>
+          <w:i w:val="0"/>
+        </w:rPr>
+        <w:t>1. We thank you for the personal hearing granted on [date], attended by [name, designation / authorised representative].</w:t>
+      </w:r>
+    </w:p>
+    <w:p>
+      <w:r>
+        <w:rPr>
+          <w:b w:val="0"/>
+          <w:i w:val="0"/>
+        </w:rPr>
+        <w:t>2. During the hearing, the following points were discussed and the following documents were sought:</w:t>
+      </w:r>
+    </w:p>
+    <w:p>
+      <w:pPr>
+        <w:pStyle w:val="ListBullet"/>
+      </w:pPr>
+      <w:r>
+        <w:t>[Point / document 1]</w:t>
+      </w:r>
+    </w:p>
+    <w:p>
+      <w:pPr>
+        <w:pStyle w:val="ListBullet"/>
+      </w:pPr>
+      <w:r>
+        <w:t>[Point / document 2]</w:t>
+      </w:r>
+    </w:p>
+    <w:p>
+      <w:r>
+        <w:rPr>
+          <w:b w:val="0"/>
+          <w:i w:val="0"/>
+        </w:rPr>
+        <w:t>3. Our submissions on these points: [answer each point; refer to annexures]</w:t>
+      </w:r>
+    </w:p>
+    <w:p>
+      <w:r>
+        <w:rPr>
+          <w:b w:val="0"/>
+          <w:i w:val="0"/>
+        </w:rPr>
+        <w:t>4. We reiterate our reply dated [date] and request that the proceedings be dropped.</w:t>
+      </w:r>
+    </w:p>
+    <w:p>
+      <w:r>
+        <w:rPr>
+          <w:b w:val="0"/>
+          <w:i w:val="0"/>
+        </w:rPr>
+        <w:t>Thanking you,</w:t>
+        <w:br/>
+        <w:t>Yours faithfully,</w:t>
+        <w:br/>
+        <w:br/>
+        <w:t>For [YOUR BUSINESS NAME]</w:t>
+        <w:br/>
+        <w:br/>
+        <w:t>(Authorised Signatory)</w:t>
+      </w:r>
+    </w:p>
+    <w:p>
+      <w:r>
+        <w:br w:type="page"/>
+      </w:r>
+    </w:p>
+    <w:p>
+      <w:pPr>
+        <w:pStyle w:val="Heading1"/>
+      </w:pPr>
+      <w:r>
+        <w:rPr>
+          <w:color w:val="002B5C"/>
+        </w:rPr>
+        <w:t>Format 13 — Request for Rectification of Order (Section 161)</w:t>
+      </w:r>
+    </w:p>
+    <w:p>
+      <w:r>
+        <w:rPr>
+          <w:b w:val="0"/>
+          <w:i/>
+        </w:rPr>
+        <w:t>For mistakes apparent on the record — wrong figures, a payment already made but not credited, a reply filed but not considered. Apply within 3 months of the order.</w:t>
+      </w:r>
+    </w:p>
+    <w:p>
+      <w:r>
+        <w:rPr>
+          <w:b/>
+          <w:i w:val="0"/>
+        </w:rPr>
+        <w:t>[YOUR BUSINESS NAME]</w:t>
+        <w:br/>
+        <w:t>[Address]</w:t>
+        <w:br/>
+        <w:t>GSTIN: [__________]     Phone: [__________]     Email: [__________]</w:t>
+      </w:r>
+    </w:p>
+    <w:p>
+      <w:r>
+        <w:rPr>
+          <w:b w:val="0"/>
+          <w:i w:val="0"/>
+        </w:rPr>
+        <w:t>Date: [DD-MM-YYYY]</w:t>
+      </w:r>
+    </w:p>
+    <w:p>
+      <w:r>
+        <w:rPr>
+          <w:b w:val="0"/>
+          <w:i w:val="0"/>
+        </w:rPr>
+        <w:t>To,</w:t>
+        <w:br/>
+        <w:t>The Proper Officer / [Designation],</w:t>
+        <w:br/>
+        <w:t>[Ward / Range / Circle],</w:t>
+        <w:br/>
+        <w:t>[State GST / CGST Office Address]</w:t>
+      </w:r>
+    </w:p>
+    <w:p>
+      <w:r>
+        <w:rPr>
+          <w:b/>
+          <w:i w:val="0"/>
+        </w:rPr>
+        <w:t>Subject: Application for rectification of order under Section 161</w:t>
+      </w:r>
+    </w:p>
+    <w:p>
+      <w:r>
+        <w:rPr>
+          <w:b w:val="0"/>
+          <w:i w:val="0"/>
+        </w:rPr>
+        <w:t>Reference: Order No. [__________] dated [DD-MM-YYYY] (Form DRC-07 / [ ]); GSTIN [__________]</w:t>
+      </w:r>
+    </w:p>
+    <w:p>
+      <w:r>
+        <w:rPr>
+          <w:b w:val="0"/>
+          <w:i w:val="0"/>
+        </w:rPr>
+        <w:t>Respected Sir / Madam,</w:t>
+      </w:r>
+    </w:p>
+    <w:p>
+      <w:r>
+        <w:rPr>
+          <w:b w:val="0"/>
+          <w:i w:val="0"/>
+        </w:rPr>
+        <w:t>1. The above order contains the following error(s) apparent on the face of the record:</w:t>
+      </w:r>
+    </w:p>
+    <w:p>
+      <w:pPr>
+        <w:pStyle w:val="ListBullet"/>
+      </w:pPr>
+      <w:r>
+        <w:t>Tax of ₹[ ] already paid vide [GSTR-3B / DRC-03 ARN ( )] dated [ ] has not been given credit.</w:t>
+      </w:r>
+    </w:p>
+    <w:p>
+      <w:pPr>
+        <w:pStyle w:val="ListBullet"/>
+      </w:pPr>
+      <w:r>
+        <w:t>Our reply dated [date] (ARN [ ]) has not been considered in the order.</w:t>
+      </w:r>
+    </w:p>
+    <w:p>
+      <w:pPr>
+        <w:pStyle w:val="ListBullet"/>
+      </w:pPr>
+      <w:r>
+        <w:t>Arithmetical error: [explain the correct calculation].</w:t>
+      </w:r>
+    </w:p>
+    <w:p>
+      <w:r>
+        <w:rPr>
+          <w:b w:val="0"/>
+          <w:i w:val="0"/>
+        </w:rPr>
+        <w:t>2. We request that the order be rectified as above and the demand be reduced to ₹[ ] / dropped. A corrected summary in Form DRC-07 may kindly be uploaded on the portal.</w:t>
+      </w:r>
+    </w:p>
+    <w:p>
+      <w:r>
+        <w:rPr>
+          <w:b w:val="0"/>
+          <w:i w:val="0"/>
+        </w:rPr>
+        <w:t>Thanking you,</w:t>
+        <w:br/>
+        <w:t>Yours faithfully,</w:t>
+        <w:br/>
+        <w:br/>
+        <w:t>For [YOUR BUSINESS NAME]</w:t>
+        <w:br/>
+        <w:br/>
+        <w:t>(Authorised Signatory)</w:t>
+      </w:r>
+    </w:p>
+    <w:p>
+      <w:r>
+        <w:br w:type="page"/>
+      </w:r>
+    </w:p>
+    <w:p>
+      <w:pPr>
+        <w:pStyle w:val="Heading1"/>
+      </w:pPr>
+      <w:r>
+        <w:rPr>
+          <w:color w:val="002B5C"/>
+        </w:rPr>
+        <w:t>Format 14 — Statement of Facts &amp; Grounds of Appeal (Form GST APL-01)</w:t>
+      </w:r>
+    </w:p>
+    <w:p>
+      <w:r>
+        <w:rPr>
+          <w:b w:val="0"/>
+          <w:i/>
+        </w:rPr>
+        <w:t>Appeal to the Appellate Authority under Section 107 within 3 months of the order (a further 1 month can be condoned for sufficient cause). Pre-deposit: the full admitted amount plus 10% of the disputed tax. Appeals are technical — we strongly suggest professional help.</w:t>
+      </w:r>
+    </w:p>
+    <w:p>
+      <w:pPr>
+        <w:pStyle w:val="Heading3"/>
+      </w:pPr>
+      <w:r>
+        <w:rPr>
+          <w:color w:val="002B5C"/>
+        </w:rPr>
+        <w:t>Statement of facts</w:t>
+      </w:r>
+    </w:p>
+    <w:p>
+      <w:pPr>
+        <w:pStyle w:val="ListBullet"/>
+      </w:pPr>
+      <w:r>
+        <w:t>The appellant is engaged in [business] and is registered under GSTIN [ ].</w:t>
+      </w:r>
+    </w:p>
+    <w:p>
+      <w:pPr>
+        <w:pStyle w:val="ListBullet"/>
+      </w:pPr>
+      <w:r>
+        <w:t>Notice [type, no., date] was issued alleging [ ]. The appellant replied on [date] (Annexure [ ]).</w:t>
+      </w:r>
+    </w:p>
+    <w:p>
+      <w:pPr>
+        <w:pStyle w:val="ListBullet"/>
+      </w:pPr>
+      <w:r>
+        <w:t>By the impugned order dated [date], the adjudicating authority confirmed a demand of tax ₹[ ], interest ₹[ ] and penalty ₹[ ].</w:t>
+      </w:r>
+    </w:p>
+    <w:p>
+      <w:pPr>
+        <w:pStyle w:val="ListBullet"/>
+      </w:pPr>
+      <w:r>
+        <w:t>Being aggrieved, the appellant files this appeal on the following grounds, which are without prejudice to one another.</w:t>
+      </w:r>
+    </w:p>
+    <w:p>
+      <w:pPr>
+        <w:pStyle w:val="Heading3"/>
+      </w:pPr>
+      <w:r>
+        <w:rPr>
+          <w:color w:val="002B5C"/>
+        </w:rPr>
+        <w:t>Grounds of appeal</w:t>
+      </w:r>
+    </w:p>
+    <w:p>
+      <w:pPr>
+        <w:pStyle w:val="ListBullet"/>
+      </w:pPr>
+      <w:r>
+        <w:t>A. The order is non-speaking: it does not deal with the submissions made in the reply dated [date].</w:t>
+      </w:r>
+    </w:p>
+    <w:p>
+      <w:pPr>
+        <w:pStyle w:val="ListBullet"/>
+      </w:pPr>
+      <w:r>
+        <w:t>B. The order violates the principles of natural justice: no / inadequate personal hearing was given (Section 75(4)).</w:t>
+      </w:r>
+    </w:p>
+    <w:p>
+      <w:pPr>
+        <w:pStyle w:val="ListBullet"/>
+      </w:pPr>
+      <w:r>
+        <w:t>C. The order travels beyond the show cause notice (Section 75(7)).</w:t>
+      </w:r>
+    </w:p>
+    <w:p>
+      <w:pPr>
+        <w:pStyle w:val="ListBullet"/>
+      </w:pPr>
+      <w:r>
+        <w:t>D. On merits: [main legal and factual ground — with documents, provisions, circulars and judgments].</w:t>
+      </w:r>
+    </w:p>
+    <w:p>
+      <w:pPr>
+        <w:pStyle w:val="ListBullet"/>
+      </w:pPr>
+      <w:r>
+        <w:t>E. The demand is barred by limitation for [period].</w:t>
+      </w:r>
+    </w:p>
+    <w:p>
+      <w:pPr>
+        <w:pStyle w:val="ListBullet"/>
+      </w:pPr>
+      <w:r>
+        <w:t>F. Interest and penalty are not leviable as the tax itself is not payable; in any case, no penalty is justified as there was no intent to evade tax.</w:t>
+      </w:r>
+    </w:p>
+    <w:p>
+      <w:pPr>
+        <w:pStyle w:val="ListBullet"/>
+      </w:pPr>
+      <w:r>
+        <w:t>The appellant craves leave to add, alter or amend any of the grounds at the time of hearing.</w:t>
+      </w:r>
+    </w:p>
+    <w:p>
+      <w:pPr>
+        <w:pStyle w:val="Heading3"/>
+      </w:pPr>
+      <w:r>
+        <w:rPr>
+          <w:color w:val="002B5C"/>
+        </w:rPr>
+        <w:t>Prayer</w:t>
+      </w:r>
+    </w:p>
+    <w:p>
+      <w:r>
+        <w:rPr>
+          <w:b w:val="0"/>
+          <w:i w:val="0"/>
+        </w:rPr>
+        <w:t>Set aside the impugned order, drop the demand of tax, interest and penalty, grant a personal hearing, and pass any other order deemed fit.</w:t>
+      </w:r>
+    </w:p>
+    <w:p>
+      <w:r>
+        <w:br w:type="page"/>
+      </w:r>
+    </w:p>
+    <w:p>
+      <w:r>
         <w:rPr>
           <w:b w:val="0"/>
           <w:i w:val="0"/>

</xml_diff>